<commit_message>
Adota Montserrat em todos os entregáveis e lê a fonte dos tokens
O corpo passa de Roboto para Montserrat (tokens 1.2.0). HTML e PDF deixam
de ter a família fixa no código e leem font_brand/font_body, como DOCX e
PPTX já faziam; o HTML só incorpora as famílias em uso. Gera as instâncias
estáticas Montserrat Regular e Medium para o ReportLab.

Tabelas genéricas do PDF passam a dimensionar as colunas pelo conteúdo,
garantindo que a palavra mais longa caiba, para a fonte mais larga não
quebrar palavras no meio. Regenera as 18 amostras e a referência 4D.

Co-Authored-By: Claude Opus 5.5 <noreply@anthropic.com>
</commit_message>
<xml_diff>
--- a/_SAMPLES_ENTREGAVEIS/evidence_recommendation/sample-evidence-recommendation-v1.0.0.docx
+++ b/_SAMPLES_ENTREGAVEIS/evidence_recommendation/sample-evidence-recommendation-v1.0.0.docx
@@ -379,6 +379,9 @@
       <w:jc w:val="right"/>
     </w:pPr>
     <w:r>
+      <w:t xml:space="preserve">EVIDÊNCIAS E RECOMENDAÇÃO    </w:t>
+    </w:r>
+    <w:r>
       <w:drawing>
         <wp:inline xmlns:a="http://schemas.openxmlformats.org/drawingml/2006/main" xmlns:pic="http://schemas.openxmlformats.org/drawingml/2006/picture">
           <wp:extent cx="1152000" cy="431878"/>
@@ -780,7 +783,7 @@
     <w:qFormat/>
     <w:rsid w:val="00FC693F"/>
     <w:rPr>
-      <w:rFonts w:ascii="Roboto" w:hAnsi="Roboto"/>
+      <w:rFonts w:ascii="Montserrat" w:hAnsi="Montserrat"/>
       <w:sz w:val="19"/>
     </w:rPr>
   </w:style>

</xml_diff>